<commit_message>
Relatório final revisado: conciliação dos totais, metodologia da previsão, perfis do K-Means e conclusões
</commit_message>
<xml_diff>
--- a/relatorio/Relatorio_Tecnico_TCC_Robson_final.docx
+++ b/relatorio/Relatorio_Tecnico_TCC_Robson_final.docx
@@ -1640,40 +1640,6 @@
     </w:p>
     <w:p>
       <w:pPr>
-        <w:pStyle w:val="Ttulo2"/>
-        <w:rPr>
-          <w:lang w:val="pt-BR" w:eastAsia="pt-BR"/>
-        </w:rPr>
-      </w:pPr>
-      <w:bookmarkStart w:id="3" w:name="_Toc74691367"/>
-      <w:r>
-        <w:rPr>
-          <w:lang w:eastAsia="pt-BR"/>
-        </w:rPr>
-        <w:t>1.</w:t>
-      </w:r>
-      <w:r>
-        <w:rPr>
-          <w:lang w:eastAsia="pt-BR"/>
-        </w:rPr>
-        <w:t>2</w:t>
-      </w:r>
-      <w:r>
-        <w:rPr>
-          <w:lang w:eastAsia="pt-BR"/>
-        </w:rPr>
-        <w:t xml:space="preserve">. </w:t>
-      </w:r>
-      <w:r>
-        <w:rPr>
-          <w:lang w:val="pt-BR" w:eastAsia="pt-BR"/>
-        </w:rPr>
-        <w:t>Objetivos</w:t>
-      </w:r>
-      <w:bookmarkEnd w:id="3"/>
-    </w:p>
-    <w:p>
-      <w:pPr>
         <w:spacing w:after="120"/>
         <w:jc w:val="both"/>
       </w:pPr>
@@ -1681,7 +1647,53 @@
         <w:rPr>
           <w:i w:val="0"/>
         </w:rPr>
-        <w:t>O objetivo geral é oferecer uma visão integrada dos fluxos de comércio exterior das 27 UFs brasileiras, que permita identificar os principais parceiros comerciais de cada estado, medir o grau de dependência em relação a poucos destinos e produtos e apoiar ações de diversificação.</w:t>
+        <w:t>A pergunta que orienta o projeto é: como uma solução de Business Intelligence e Analytics, construída com dados públicos do Comex Stat, pode apoiar a identificação dos principais parceiros comerciais, a avaliação da concentração das exportações e a caracterização dos perfis comerciais das UFs brasileiras?</w:t>
+      </w:r>
+    </w:p>
+    <w:p>
+      <w:pPr>
+        <w:pStyle w:val="Ttulo2"/>
+        <w:rPr>
+          <w:lang w:val="pt-BR" w:eastAsia="pt-BR"/>
+        </w:rPr>
+      </w:pPr>
+      <w:bookmarkStart w:id="3" w:name="_Toc74691367"/>
+      <w:r>
+        <w:rPr>
+          <w:lang w:eastAsia="pt-BR"/>
+        </w:rPr>
+        <w:t>1.</w:t>
+      </w:r>
+      <w:r>
+        <w:rPr>
+          <w:lang w:eastAsia="pt-BR"/>
+        </w:rPr>
+        <w:t>2</w:t>
+      </w:r>
+      <w:r>
+        <w:rPr>
+          <w:lang w:eastAsia="pt-BR"/>
+        </w:rPr>
+        <w:t xml:space="preserve">. </w:t>
+      </w:r>
+      <w:r>
+        <w:rPr>
+          <w:lang w:val="pt-BR" w:eastAsia="pt-BR"/>
+        </w:rPr>
+        <w:t>Objetivos</w:t>
+      </w:r>
+      <w:bookmarkEnd w:id="3"/>
+    </w:p>
+    <w:p>
+      <w:pPr>
+        <w:spacing w:after="120"/>
+        <w:jc w:val="both"/>
+      </w:pPr>
+      <w:r>
+        <w:rPr>
+          <w:i w:val="0"/>
+        </w:rPr>
+        <w:t>O objetivo geral é desenvolver uma solução de Business Intelligence e Analytics, baseada em dados públicos do Comex Stat, para analisar os fluxos de comércio exterior das 27 UFs brasileiras, identificar seus principais parceiros comerciais, avaliar a concentração das exportações e explorar perfis comerciais por meio de técnicas de análise de dados e aprendizado de máquina.</w:t>
       </w:r>
     </w:p>
     <w:p>
@@ -2285,7 +2297,7 @@
                 <w:b w:val="0"/>
                 <w:sz w:val="18"/>
               </w:rPr>
-              <w:t>O valor vem de volume ou de valor agregado?</w:t>
+              <w:t>Qual o valor unitário médio da pauta exportada?</w:t>
             </w:r>
           </w:p>
         </w:tc>
@@ -2337,19 +2349,7 @@
         <w:rPr>
           <w:lang w:eastAsia="pt-BR"/>
         </w:rPr>
-        <w:t>1.</w:t>
-      </w:r>
-      <w:r>
-        <w:rPr>
-          <w:lang w:val="pt-BR" w:eastAsia="pt-BR"/>
-        </w:rPr>
-        <w:t>3</w:t>
-      </w:r>
-      <w:r>
-        <w:rPr>
-          <w:lang w:eastAsia="pt-BR"/>
-        </w:rPr>
-        <w:t>. Público alvo</w:t>
+        <w:t>1.3. Público-alvo</w:t>
       </w:r>
       <w:bookmarkEnd w:id="4"/>
     </w:p>
@@ -2606,7 +2606,7 @@
                 <w:b w:val="0"/>
                 <w:sz w:val="18"/>
               </w:rPr>
-              <w:t>% Principal destino ≤ 35% nas UFs mais concentradas em 3 anos; aumento do preço médio (US$/kg); crescimento da exportação.</w:t>
+              <w:t>Indicadores do Quadro 1. Metas propostas pelo projeto (a validar com os gestores): % Principal destino ≤ 35% nas UFs mais concentradas em 3 anos; aumento do preço médio (US$/kg); crescimento da exportação.</w:t>
             </w:r>
           </w:p>
         </w:tc>
@@ -2648,7 +2648,7 @@
                 <w:b w:val="0"/>
                 <w:sz w:val="18"/>
               </w:rPr>
-              <w:t>Medidas DAX sobre a fato (Quadro 1 e Quadro 6).</w:t>
+              <w:t>Medidas DAX sobre a fato (Quadro 1 e Quadro 5).</w:t>
             </w:r>
           </w:p>
         </w:tc>
@@ -4553,7 +4553,7 @@
         <w:rPr>
           <w:i w:val="0"/>
         </w:rPr>
-        <w:t>O ETL foi implementado no script etl_comex.py, em Python com a biblioteca pandas, e executado no Anaconda. A Figura 3 resume as etapas.</w:t>
+        <w:t>O processo de ETL (do inglês Extract, Transform, Load: extração, transformação e carga) foi implementado no script etl_comex.py, em Python com a biblioteca pandas, e executado no Anaconda. A Figura 3 resume as etapas.</w:t>
       </w:r>
     </w:p>
     <w:p>
@@ -5838,6 +5838,18 @@
     </w:p>
     <w:p>
       <w:pPr>
+        <w:spacing w:after="120"/>
+        <w:jc w:val="both"/>
+      </w:pPr>
+      <w:r>
+        <w:rPr>
+          <w:i w:val="0"/>
+        </w:rPr>
+        <w:t>Na regressão, a tendência é o número de meses desde janeiro de 2022 (t = 0, 1, 2, …) e a sazonalidade é representada por 11 variáveis indicadoras (dummies) de mês, com janeiro como referência; os coeficientes são estimados por mínimos quadrados ordinários. No Holt-Winters, os parâmetros de nível (α) e de sazonalidade (γ) foram testados de 0,05 a 0,95, com passo de 0,1, e o de tendência (β) nos valores 0,01, 0,05, 0,10 e 0,20, escolhendo a combinação de menor soma dos erros quadráticos no ajuste um passo à frente do período de treino. O MAPE é a média, nos 9 meses de teste, de |real − previsto| ÷ real, em percentual; o MAE é a média de |real − previsto|, em US$ bilhões por mês.</w:t>
+      </w:r>
+    </w:p>
+    <w:p>
+      <w:pPr>
         <w:keepNext/>
         <w:spacing w:after="40"/>
         <w:ind w:firstLine="0"/>
@@ -6477,7 +6489,7 @@
         <w:rPr>
           <w:i w:val="0"/>
         </w:rPr>
-        <w:t>A regressão teve o menor erro nos dois fluxos e foi reajustada com os 57 meses para projetar outubro de 2026 a dezembro de 2027 (Figura 8 e Quadro 7).</w:t>
+        <w:t>A regressão teve o menor erro nos dois fluxos e foi reajustada com os 57 meses para projetar outubro de 2026 a dezembro de 2027 (Figura 8 e Quadro 7). Como indicação da incerteza, cada mês projetado tem uma faixa aproximada de 95%, igual à previsão ± 1,96 × o desvio-padrão dos erros no período de teste; para outubro a dezembro de 2026, a exportação prevista de US$ 90,4 bi fica entre US$ 79,8 bi e US$ 100,9 bi. Por ter sido avaliada em uma única janela de teste de 9 meses, a vantagem da regressão é uma evidência limitada e não garante que ela continuará sendo o melhor modelo em períodos futuros.</w:t>
       </w:r>
     </w:p>
     <w:p>
@@ -6563,7 +6575,7 @@
           <w:i w:val="0"/>
           <w:sz w:val="20"/>
         </w:rPr>
-        <w:t>Quadro 7 – Totais anuais reais e projetados</w:t>
+        <w:t>Quadro 7 – Totais anuais realizados, previstos e estimados</w:t>
       </w:r>
     </w:p>
     <w:tbl>
@@ -6693,7 +6705,7 @@
                 <w:b w:val="0"/>
                 <w:sz w:val="18"/>
               </w:rPr>
-              <w:t>2022 (real)</w:t>
+              <w:t>2022 (realizado)</w:t>
             </w:r>
           </w:p>
         </w:tc>
@@ -6775,7 +6787,7 @@
                 <w:b w:val="0"/>
                 <w:sz w:val="18"/>
               </w:rPr>
-              <w:t>2023 (real)</w:t>
+              <w:t>2023 (realizado)</w:t>
             </w:r>
           </w:p>
         </w:tc>
@@ -6857,7 +6869,7 @@
                 <w:b w:val="0"/>
                 <w:sz w:val="18"/>
               </w:rPr>
-              <w:t>2024 (real)</w:t>
+              <w:t>2024 (realizado)</w:t>
             </w:r>
           </w:p>
         </w:tc>
@@ -6939,7 +6951,7 @@
                 <w:b w:val="0"/>
                 <w:sz w:val="18"/>
               </w:rPr>
-              <w:t>2025 (real)</w:t>
+              <w:t>2025 (realizado)</w:t>
             </w:r>
           </w:p>
         </w:tc>
@@ -7021,7 +7033,7 @@
                 <w:b w:val="0"/>
                 <w:sz w:val="18"/>
               </w:rPr>
-              <w:t>2026 (real jan–set + previsão)</w:t>
+              <w:t>2026 – realizado (jan–set)</w:t>
             </w:r>
           </w:p>
         </w:tc>
@@ -7041,7 +7053,7 @@
                 <w:b w:val="0"/>
                 <w:sz w:val="18"/>
               </w:rPr>
-              <w:t>374,3</w:t>
+              <w:t>284,0</w:t>
             </w:r>
           </w:p>
         </w:tc>
@@ -7061,7 +7073,7 @@
                 <w:b w:val="0"/>
                 <w:sz w:val="18"/>
               </w:rPr>
-              <w:t>291,7</w:t>
+              <w:t>221,7</w:t>
             </w:r>
           </w:p>
         </w:tc>
@@ -7081,7 +7093,7 @@
                 <w:b w:val="0"/>
                 <w:sz w:val="18"/>
               </w:rPr>
-              <w:t>82,6</w:t>
+              <w:t>62,3</w:t>
             </w:r>
           </w:p>
         </w:tc>
@@ -7103,7 +7115,171 @@
                 <w:b w:val="0"/>
                 <w:sz w:val="18"/>
               </w:rPr>
-              <w:t>2027 (previsão)</w:t>
+              <w:t>2026 – previsto (out–dez)</w:t>
+            </w:r>
+          </w:p>
+        </w:tc>
+        <w:tc>
+          <w:tcPr>
+            <w:tcW w:type="dxa" w:w="1984"/>
+          </w:tcPr>
+          <w:p>
+            <w:pPr>
+              <w:spacing w:after="20" w:before="20" w:line="240" w:lineRule="auto"/>
+              <w:ind w:firstLine="0"/>
+              <w:jc w:val="left"/>
+            </w:pPr>
+            <w:r/>
+            <w:r>
+              <w:rPr>
+                <w:b w:val="0"/>
+                <w:sz w:val="18"/>
+              </w:rPr>
+              <w:t>90,4</w:t>
+            </w:r>
+          </w:p>
+        </w:tc>
+        <w:tc>
+          <w:tcPr>
+            <w:tcW w:type="dxa" w:w="1984"/>
+          </w:tcPr>
+          <w:p>
+            <w:pPr>
+              <w:spacing w:after="20" w:before="20" w:line="240" w:lineRule="auto"/>
+              <w:ind w:firstLine="0"/>
+              <w:jc w:val="left"/>
+            </w:pPr>
+            <w:r/>
+            <w:r>
+              <w:rPr>
+                <w:b w:val="0"/>
+                <w:sz w:val="18"/>
+              </w:rPr>
+              <w:t>70,0</w:t>
+            </w:r>
+          </w:p>
+        </w:tc>
+        <w:tc>
+          <w:tcPr>
+            <w:tcW w:type="dxa" w:w="1984"/>
+          </w:tcPr>
+          <w:p>
+            <w:pPr>
+              <w:spacing w:after="20" w:before="20" w:line="240" w:lineRule="auto"/>
+              <w:ind w:firstLine="0"/>
+              <w:jc w:val="left"/>
+            </w:pPr>
+            <w:r/>
+            <w:r>
+              <w:rPr>
+                <w:b w:val="0"/>
+                <w:sz w:val="18"/>
+              </w:rPr>
+              <w:t>20,4</w:t>
+            </w:r>
+          </w:p>
+        </w:tc>
+      </w:tr>
+      <w:tr>
+        <w:tc>
+          <w:tcPr>
+            <w:tcW w:type="dxa" w:w="3118"/>
+          </w:tcPr>
+          <w:p>
+            <w:pPr>
+              <w:spacing w:after="20" w:before="20" w:line="240" w:lineRule="auto"/>
+              <w:ind w:firstLine="0"/>
+              <w:jc w:val="left"/>
+            </w:pPr>
+            <w:r/>
+            <w:r>
+              <w:rPr>
+                <w:b/>
+                <w:sz w:val="18"/>
+              </w:rPr>
+              <w:t>2026 – total estimado (realizado + previsto)</w:t>
+            </w:r>
+          </w:p>
+        </w:tc>
+        <w:tc>
+          <w:tcPr>
+            <w:tcW w:type="dxa" w:w="1984"/>
+          </w:tcPr>
+          <w:p>
+            <w:pPr>
+              <w:spacing w:after="20" w:before="20" w:line="240" w:lineRule="auto"/>
+              <w:ind w:firstLine="0"/>
+              <w:jc w:val="left"/>
+            </w:pPr>
+            <w:r/>
+            <w:r>
+              <w:rPr>
+                <w:b/>
+                <w:sz w:val="18"/>
+              </w:rPr>
+              <w:t>374,3</w:t>
+            </w:r>
+          </w:p>
+        </w:tc>
+        <w:tc>
+          <w:tcPr>
+            <w:tcW w:type="dxa" w:w="1984"/>
+          </w:tcPr>
+          <w:p>
+            <w:pPr>
+              <w:spacing w:after="20" w:before="20" w:line="240" w:lineRule="auto"/>
+              <w:ind w:firstLine="0"/>
+              <w:jc w:val="left"/>
+            </w:pPr>
+            <w:r/>
+            <w:r>
+              <w:rPr>
+                <w:b/>
+                <w:sz w:val="18"/>
+              </w:rPr>
+              <w:t>291,7</w:t>
+            </w:r>
+          </w:p>
+        </w:tc>
+        <w:tc>
+          <w:tcPr>
+            <w:tcW w:type="dxa" w:w="1984"/>
+          </w:tcPr>
+          <w:p>
+            <w:pPr>
+              <w:spacing w:after="20" w:before="20" w:line="240" w:lineRule="auto"/>
+              <w:ind w:firstLine="0"/>
+              <w:jc w:val="left"/>
+            </w:pPr>
+            <w:r/>
+            <w:r>
+              <w:rPr>
+                <w:b/>
+                <w:sz w:val="18"/>
+              </w:rPr>
+              <w:t>82,6</w:t>
+            </w:r>
+          </w:p>
+        </w:tc>
+      </w:tr>
+      <w:tr>
+        <w:tc>
+          <w:tcPr>
+            <w:tcW w:type="dxa" w:w="3118"/>
+          </w:tcPr>
+          <w:p>
+            <w:pPr>
+              <w:spacing w:after="20" w:before="20" w:line="240" w:lineRule="auto"/>
+              <w:ind w:firstLine="0"/>
+              <w:jc w:val="left"/>
+            </w:pPr>
+            <w:r/>
+            <w:r>
+              <w:rPr>
+                <w:b w:val="0"/>
+                <w:sz w:val="18"/>
+              </w:rPr>
+              <w:t>2027 – previsto (jan–dez)</w:t>
             </w:r>
           </w:p>
         </w:tc>
@@ -7180,7 +7356,7 @@
           <w:i w:val="0"/>
           <w:sz w:val="18"/>
         </w:rPr>
-        <w:t>Fonte: elaborado pelo autor.</w:t>
+        <w:t>Fonte: elaborado pelo autor. Valores com os filtros do painel (sem UFs EX/ND e países 100/105). Os totais de 2026 e 2027 são estimativas, não resultados observados.</w:t>
       </w:r>
     </w:p>
     <w:p>
@@ -7192,7 +7368,7 @@
         <w:rPr>
           <w:i w:val="0"/>
         </w:rPr>
-        <w:t>A análise revela sazonalidade marcada nas exportações, com queda em janeiro e fevereiro e pico entre março e julho, coerente com o calendário da safra de grãos. O modelo subestimou o período de teste em 7,8% (US$ 261,9 bi previstos contra US$ 284,0 bi realizados), pois as exportações de 2026 cresceram 10,3% sobre o mesmo período de 2025, acima da tendência histórica.</w:t>
+        <w:t>A análise revela sazonalidade marcada nas exportações, com queda em janeiro e fevereiro e pico entre março e julho, coerente com o calendário da safra de grãos. No período de teste, o modelo subestimou a exportação em 7,8% (US$ 261,9 bi previstos contra US$ 284,0 bi realizados de janeiro a setembro de 2026), pois as exportações de 2026 cresceram 10,3% sobre o mesmo período de 2025, acima da tendência histórica.</w:t>
       </w:r>
     </w:p>
     <w:p>
@@ -7219,7 +7395,19 @@
         <w:rPr>
           <w:i w:val="0"/>
         </w:rPr>
-        <w:t>Para cada UF foram calculados oito indicadores sobre as exportações do período: concentração de destinos (índice Herfindahl-Hirschman), participação de China, EUA, União Europeia e Mercosul, concentração de produtos (HHI por SH4), participação de produtos básicos (capítulos SH 01 a 27) e preço médio (US$/kg, em logaritmo). Os indicadores foram padronizados e agrupados com o algoritmo K-Means (PEDREGOSA et al., 2011). O número de grupos foi escolhido pelo coeficiente de silhueta (ROUSSEEUW, 1987), testando k de 2 a 6, com a regra de 3 a 5 grupos e pelo menos 3 UFs por grupo, o que resultou em k = 3.</w:t>
+        <w:t>Para cada UF foram calculados oito indicadores sobre as exportações do período: concentração de destinos (índice Herfindahl-Hirschman), participação de China, EUA, União Europeia e Mercosul, concentração de produtos (HHI por SH4), participação de produtos básicos (capítulos SH 01 a 27) e preço médio (US$/kg, em logaritmo). Os indicadores foram padronizados e agrupados com o algoritmo K-Means (PEDREGOSA et al., 2011). O número de grupos foi escolhido pelo coeficiente de silhueta (ROUSSEEUW, 1987), testando k de 2 a 6, com a regra de 3 a 5 grupos e pelo menos 3 UFs por grupo, o que resultou em k = 3. A regra de tamanho evita grupos de uma ou duas UFs, que pouco ajudariam a orientar ações.</w:t>
+      </w:r>
+    </w:p>
+    <w:p>
+      <w:pPr>
+        <w:spacing w:after="120"/>
+        <w:jc w:val="both"/>
+      </w:pPr>
+      <w:r>
+        <w:rPr>
+          <w:i w:val="0"/>
+        </w:rPr>
+        <w:t>Os grupos devem ser lidos como perfis exploratórios, que resumem semelhanças entre as UFs segundo esses oito indicadores, e não como categorias definitivas dos estados: com 27 observações e silhueta de 0,24, as fronteiras entre grupos são pouco nítidas e algumas UFs ficam próximas de mais de um perfil. O Quadro 8 mostra a média de cada indicador por grupo, o que permite verificar quais variáveis sustentam a interpretação.</w:t>
       </w:r>
     </w:p>
     <w:p>
@@ -7305,7 +7493,7 @@
           <w:i w:val="0"/>
           <w:sz w:val="20"/>
         </w:rPr>
-        <w:t>Quadro 8 – Perfis de UFs identificados pelo K-Means</w:t>
+        <w:t>Quadro 8 – Perfis exploratórios de UFs identificados pelo K-Means: média dos indicadores por grupo</w:t>
       </w:r>
     </w:p>
     <w:tbl>
@@ -7324,13 +7512,11 @@
         <w:tblLook w:firstColumn="1" w:firstRow="1" w:lastColumn="0" w:lastRow="0" w:noHBand="0" w:noVBand="1" w:val="04A0"/>
       </w:tblPr>
       <w:tblGrid>
+        <w:gridCol w:w="2494"/>
         <w:gridCol w:w="2041"/>
-        <w:gridCol w:w="2494"/>
-        <w:gridCol w:w="1190"/>
-        <w:gridCol w:w="793"/>
-        <w:gridCol w:w="907"/>
-        <w:gridCol w:w="850"/>
-        <w:gridCol w:w="793"/>
+        <w:gridCol w:w="1814"/>
+        <w:gridCol w:w="1474"/>
+        <w:gridCol w:w="1247"/>
       </w:tblGrid>
       <w:tr>
         <w:trPr>
@@ -7338,6 +7524,27 @@
         </w:trPr>
         <w:tc>
           <w:tcPr>
+            <w:tcW w:type="dxa" w:w="2494"/>
+            <w:shd w:val="clear" w:color="auto" w:fill="DCE6F2"/>
+          </w:tcPr>
+          <w:p>
+            <w:pPr>
+              <w:spacing w:after="20" w:before="20" w:line="240" w:lineRule="auto"/>
+              <w:ind w:firstLine="0"/>
+              <w:jc w:val="left"/>
+            </w:pPr>
+            <w:r/>
+            <w:r>
+              <w:rPr>
+                <w:b/>
+                <w:sz w:val="16"/>
+              </w:rPr>
+              <w:t>Indicador</w:t>
+            </w:r>
+          </w:p>
+        </w:tc>
+        <w:tc>
+          <w:tcPr>
             <w:tcW w:type="dxa" w:w="2041"/>
             <w:shd w:val="clear" w:color="auto" w:fill="DCE6F2"/>
           </w:tcPr>
@@ -7351,15 +7558,15 @@
             <w:r>
               <w:rPr>
                 <w:b/>
-                <w:sz w:val="17"/>
-              </w:rPr>
-              <w:t>Grupo</w:t>
-            </w:r>
-          </w:p>
-        </w:tc>
-        <w:tc>
-          <w:tcPr>
-            <w:tcW w:type="dxa" w:w="2494"/>
+                <w:sz w:val="16"/>
+              </w:rPr>
+              <w:t>G1 – Diversificados</w:t>
+            </w:r>
+          </w:p>
+        </w:tc>
+        <w:tc>
+          <w:tcPr>
+            <w:tcW w:type="dxa" w:w="1814"/>
             <w:shd w:val="clear" w:color="auto" w:fill="DCE6F2"/>
           </w:tcPr>
           <w:p>
@@ -7372,15 +7579,15 @@
             <w:r>
               <w:rPr>
                 <w:b/>
-                <w:sz w:val="17"/>
-              </w:rPr>
-              <w:t>UFs</w:t>
-            </w:r>
-          </w:p>
-        </w:tc>
-        <w:tc>
-          <w:tcPr>
-            <w:tcW w:type="dxa" w:w="1191"/>
+                <w:sz w:val="16"/>
+              </w:rPr>
+              <w:t>G2 – Commodities / China</w:t>
+            </w:r>
+          </w:p>
+        </w:tc>
+        <w:tc>
+          <w:tcPr>
+            <w:tcW w:type="dxa" w:w="1474"/>
             <w:shd w:val="clear" w:color="auto" w:fill="DCE6F2"/>
           </w:tcPr>
           <w:p>
@@ -7393,15 +7600,15 @@
             <w:r>
               <w:rPr>
                 <w:b/>
-                <w:sz w:val="17"/>
-              </w:rPr>
-              <w:t>Exportação 2022–26 (US$ bi)</w:t>
-            </w:r>
-          </w:p>
-        </w:tc>
-        <w:tc>
-          <w:tcPr>
-            <w:tcW w:type="dxa" w:w="794"/>
+                <w:sz w:val="16"/>
+              </w:rPr>
+              <w:t>G3 – EUA e UE</w:t>
+            </w:r>
+          </w:p>
+        </w:tc>
+        <w:tc>
+          <w:tcPr>
+            <w:tcW w:type="dxa" w:w="1247"/>
             <w:shd w:val="clear" w:color="auto" w:fill="DCE6F2"/>
           </w:tcPr>
           <w:p>
@@ -7414,72 +7621,9 @@
             <w:r>
               <w:rPr>
                 <w:b/>
-                <w:sz w:val="17"/>
-              </w:rPr>
-              <w:t>% China</w:t>
-            </w:r>
-          </w:p>
-        </w:tc>
-        <w:tc>
-          <w:tcPr>
-            <w:tcW w:type="dxa" w:w="907"/>
-            <w:shd w:val="clear" w:color="auto" w:fill="DCE6F2"/>
-          </w:tcPr>
-          <w:p>
-            <w:pPr>
-              <w:spacing w:after="20" w:before="20" w:line="240" w:lineRule="auto"/>
-              <w:ind w:firstLine="0"/>
-              <w:jc w:val="left"/>
-            </w:pPr>
-            <w:r/>
-            <w:r>
-              <w:rPr>
-                <w:b/>
-                <w:sz w:val="17"/>
-              </w:rPr>
-              <w:t>% EUA + UE</w:t>
-            </w:r>
-          </w:p>
-        </w:tc>
-        <w:tc>
-          <w:tcPr>
-            <w:tcW w:type="dxa" w:w="850"/>
-            <w:shd w:val="clear" w:color="auto" w:fill="DCE6F2"/>
-          </w:tcPr>
-          <w:p>
-            <w:pPr>
-              <w:spacing w:after="20" w:before="20" w:line="240" w:lineRule="auto"/>
-              <w:ind w:firstLine="0"/>
-              <w:jc w:val="left"/>
-            </w:pPr>
-            <w:r/>
-            <w:r>
-              <w:rPr>
-                <w:b/>
-                <w:sz w:val="17"/>
-              </w:rPr>
-              <w:t>% básicos</w:t>
-            </w:r>
-          </w:p>
-        </w:tc>
-        <w:tc>
-          <w:tcPr>
-            <w:tcW w:type="dxa" w:w="794"/>
-            <w:shd w:val="clear" w:color="auto" w:fill="DCE6F2"/>
-          </w:tcPr>
-          <w:p>
-            <w:pPr>
-              <w:spacing w:after="20" w:before="20" w:line="240" w:lineRule="auto"/>
-              <w:ind w:firstLine="0"/>
-              <w:jc w:val="left"/>
-            </w:pPr>
-            <w:r/>
-            <w:r>
-              <w:rPr>
-                <w:b/>
-                <w:sz w:val="17"/>
-              </w:rPr>
-              <w:t>1º destino (média)</w:t>
+                <w:sz w:val="16"/>
+              </w:rPr>
+              <w:t>Média das 27 UFs</w:t>
             </w:r>
           </w:p>
         </w:tc>
@@ -7487,6 +7631,26 @@
       <w:tr>
         <w:tc>
           <w:tcPr>
+            <w:tcW w:type="dxa" w:w="2494"/>
+          </w:tcPr>
+          <w:p>
+            <w:pPr>
+              <w:spacing w:after="20" w:before="20" w:line="240" w:lineRule="auto"/>
+              <w:ind w:firstLine="0"/>
+              <w:jc w:val="left"/>
+            </w:pPr>
+            <w:r/>
+            <w:r>
+              <w:rPr>
+                <w:b/>
+                <w:sz w:val="16"/>
+              </w:rPr>
+              <w:t>UFs</w:t>
+            </w:r>
+          </w:p>
+        </w:tc>
+        <w:tc>
+          <w:tcPr>
             <w:tcW w:type="dxa" w:w="2041"/>
           </w:tcPr>
           <w:p>
@@ -7499,129 +7663,69 @@
             <w:r>
               <w:rPr>
                 <w:b w:val="0"/>
-                <w:sz w:val="17"/>
-              </w:rPr>
-              <w:t>G1 – Pauta e destinos diversificados</w:t>
-            </w:r>
-          </w:p>
-        </w:tc>
-        <w:tc>
-          <w:tcPr>
-            <w:tcW w:type="dxa" w:w="2494"/>
-          </w:tcPr>
-          <w:p>
-            <w:pPr>
-              <w:spacing w:after="20" w:before="20" w:line="240" w:lineRule="auto"/>
-              <w:ind w:firstLine="0"/>
-              <w:jc w:val="left"/>
-            </w:pPr>
-            <w:r/>
-            <w:r>
-              <w:rPr>
-                <w:b w:val="0"/>
-                <w:sz w:val="17"/>
-              </w:rPr>
-              <w:t>AC, AM, BA, DF, MA, MG, MS, PE, PR, RS, SC, SP</w:t>
-            </w:r>
-          </w:p>
-        </w:tc>
-        <w:tc>
-          <w:tcPr>
-            <w:tcW w:type="dxa" w:w="1191"/>
-          </w:tcPr>
-          <w:p>
-            <w:pPr>
-              <w:spacing w:after="20" w:before="20" w:line="240" w:lineRule="auto"/>
-              <w:ind w:firstLine="0"/>
-              <w:jc w:val="left"/>
-            </w:pPr>
-            <w:r/>
-            <w:r>
-              <w:rPr>
-                <w:b w:val="0"/>
-                <w:sz w:val="17"/>
-              </w:rPr>
-              <w:t>980,7</w:t>
-            </w:r>
-          </w:p>
-        </w:tc>
-        <w:tc>
-          <w:tcPr>
-            <w:tcW w:type="dxa" w:w="794"/>
-          </w:tcPr>
-          <w:p>
-            <w:pPr>
-              <w:spacing w:after="20" w:before="20" w:line="240" w:lineRule="auto"/>
-              <w:ind w:firstLine="0"/>
-              <w:jc w:val="left"/>
-            </w:pPr>
-            <w:r/>
-            <w:r>
-              <w:rPr>
-                <w:b w:val="0"/>
-                <w:sz w:val="17"/>
-              </w:rPr>
-              <w:t>20%</w:t>
-            </w:r>
-          </w:p>
-        </w:tc>
-        <w:tc>
-          <w:tcPr>
-            <w:tcW w:type="dxa" w:w="907"/>
-          </w:tcPr>
-          <w:p>
-            <w:pPr>
-              <w:spacing w:after="20" w:before="20" w:line="240" w:lineRule="auto"/>
-              <w:ind w:firstLine="0"/>
-              <w:jc w:val="left"/>
-            </w:pPr>
-            <w:r/>
-            <w:r>
-              <w:rPr>
-                <w:b w:val="0"/>
-                <w:sz w:val="17"/>
-              </w:rPr>
-              <w:t>23%</w:t>
-            </w:r>
-          </w:p>
-        </w:tc>
-        <w:tc>
-          <w:tcPr>
-            <w:tcW w:type="dxa" w:w="850"/>
-          </w:tcPr>
-          <w:p>
-            <w:pPr>
-              <w:spacing w:after="20" w:before="20" w:line="240" w:lineRule="auto"/>
-              <w:ind w:firstLine="0"/>
-              <w:jc w:val="left"/>
-            </w:pPr>
-            <w:r/>
-            <w:r>
-              <w:rPr>
-                <w:b w:val="0"/>
-                <w:sz w:val="17"/>
-              </w:rPr>
-              <w:t>60%</w:t>
-            </w:r>
-          </w:p>
-        </w:tc>
-        <w:tc>
-          <w:tcPr>
-            <w:tcW w:type="dxa" w:w="794"/>
-          </w:tcPr>
-          <w:p>
-            <w:pPr>
-              <w:spacing w:after="20" w:before="20" w:line="240" w:lineRule="auto"/>
-              <w:ind w:firstLine="0"/>
-              <w:jc w:val="left"/>
-            </w:pPr>
-            <w:r/>
-            <w:r>
-              <w:rPr>
-                <w:b w:val="0"/>
-                <w:sz w:val="17"/>
-              </w:rPr>
-              <w:t>26%</w:t>
+                <w:sz w:val="16"/>
+              </w:rPr>
+              <w:t>12 (AC, AM, BA, DF, MA, MG, MS, PE, PR, RS, SC, SP)</w:t>
+            </w:r>
+          </w:p>
+        </w:tc>
+        <w:tc>
+          <w:tcPr>
+            <w:tcW w:type="dxa" w:w="1814"/>
+          </w:tcPr>
+          <w:p>
+            <w:pPr>
+              <w:spacing w:after="20" w:before="20" w:line="240" w:lineRule="auto"/>
+              <w:ind w:firstLine="0"/>
+              <w:jc w:val="left"/>
+            </w:pPr>
+            <w:r/>
+            <w:r>
+              <w:rPr>
+                <w:b w:val="0"/>
+                <w:sz w:val="16"/>
+              </w:rPr>
+              <w:t>9 (AL, GO, MT, PA, PI, RJ, RO, RR, TO)</w:t>
+            </w:r>
+          </w:p>
+        </w:tc>
+        <w:tc>
+          <w:tcPr>
+            <w:tcW w:type="dxa" w:w="1474"/>
+          </w:tcPr>
+          <w:p>
+            <w:pPr>
+              <w:spacing w:after="20" w:before="20" w:line="240" w:lineRule="auto"/>
+              <w:ind w:firstLine="0"/>
+              <w:jc w:val="left"/>
+            </w:pPr>
+            <w:r/>
+            <w:r>
+              <w:rPr>
+                <w:b w:val="0"/>
+                <w:sz w:val="16"/>
+              </w:rPr>
+              <w:t>6 (AP, CE, ES, PB, RN, SE)</w:t>
+            </w:r>
+          </w:p>
+        </w:tc>
+        <w:tc>
+          <w:tcPr>
+            <w:tcW w:type="dxa" w:w="1247"/>
+          </w:tcPr>
+          <w:p>
+            <w:pPr>
+              <w:spacing w:after="20" w:before="20" w:line="240" w:lineRule="auto"/>
+              <w:ind w:firstLine="0"/>
+              <w:jc w:val="left"/>
+            </w:pPr>
+            <w:r/>
+            <w:r>
+              <w:rPr>
+                <w:b w:val="0"/>
+                <w:sz w:val="16"/>
+              </w:rPr>
+              <w:t>27</w:t>
             </w:r>
           </w:p>
         </w:tc>
@@ -7629,6 +7733,26 @@
       <w:tr>
         <w:tc>
           <w:tcPr>
+            <w:tcW w:type="dxa" w:w="2494"/>
+          </w:tcPr>
+          <w:p>
+            <w:pPr>
+              <w:spacing w:after="20" w:before="20" w:line="240" w:lineRule="auto"/>
+              <w:ind w:firstLine="0"/>
+              <w:jc w:val="left"/>
+            </w:pPr>
+            <w:r/>
+            <w:r>
+              <w:rPr>
+                <w:b/>
+                <w:sz w:val="16"/>
+              </w:rPr>
+              <w:t>Exportação 2022–26 (US$ bi)</w:t>
+            </w:r>
+          </w:p>
+        </w:tc>
+        <w:tc>
+          <w:tcPr>
             <w:tcW w:type="dxa" w:w="2041"/>
           </w:tcPr>
           <w:p>
@@ -7641,47 +7765,27 @@
             <w:r>
               <w:rPr>
                 <w:b w:val="0"/>
-                <w:sz w:val="17"/>
-              </w:rPr>
-              <w:t>G2 – Commodities concentradas na China</w:t>
-            </w:r>
-          </w:p>
-        </w:tc>
-        <w:tc>
-          <w:tcPr>
-            <w:tcW w:type="dxa" w:w="2494"/>
-          </w:tcPr>
-          <w:p>
-            <w:pPr>
-              <w:spacing w:after="20" w:before="20" w:line="240" w:lineRule="auto"/>
-              <w:ind w:firstLine="0"/>
-              <w:jc w:val="left"/>
-            </w:pPr>
-            <w:r/>
-            <w:r>
-              <w:rPr>
-                <w:b w:val="0"/>
-                <w:sz w:val="17"/>
-              </w:rPr>
-              <w:t>AL, GO, MT, PA, PI, RJ, RO, RR, TO</w:t>
-            </w:r>
-          </w:p>
-        </w:tc>
-        <w:tc>
-          <w:tcPr>
-            <w:tcW w:type="dxa" w:w="1191"/>
-          </w:tcPr>
-          <w:p>
-            <w:pPr>
-              <w:spacing w:after="20" w:before="20" w:line="240" w:lineRule="auto"/>
-              <w:ind w:firstLine="0"/>
-              <w:jc w:val="left"/>
-            </w:pPr>
-            <w:r/>
-            <w:r>
-              <w:rPr>
-                <w:b w:val="0"/>
-                <w:sz w:val="17"/>
+                <w:sz w:val="16"/>
+              </w:rPr>
+              <w:t>980,7</w:t>
+            </w:r>
+          </w:p>
+        </w:tc>
+        <w:tc>
+          <w:tcPr>
+            <w:tcW w:type="dxa" w:w="1814"/>
+          </w:tcPr>
+          <w:p>
+            <w:pPr>
+              <w:spacing w:after="20" w:before="20" w:line="240" w:lineRule="auto"/>
+              <w:ind w:firstLine="0"/>
+              <w:jc w:val="left"/>
+            </w:pPr>
+            <w:r/>
+            <w:r>
+              <w:rPr>
+                <w:b w:val="0"/>
+                <w:sz w:val="16"/>
               </w:rPr>
               <w:t>593,7</w:t>
             </w:r>
@@ -7689,81 +7793,41 @@
         </w:tc>
         <w:tc>
           <w:tcPr>
-            <w:tcW w:type="dxa" w:w="794"/>
-          </w:tcPr>
-          <w:p>
-            <w:pPr>
-              <w:spacing w:after="20" w:before="20" w:line="240" w:lineRule="auto"/>
-              <w:ind w:firstLine="0"/>
-              <w:jc w:val="left"/>
-            </w:pPr>
-            <w:r/>
-            <w:r>
-              <w:rPr>
-                <w:b w:val="0"/>
-                <w:sz w:val="17"/>
-              </w:rPr>
-              <w:t>38%</w:t>
-            </w:r>
-          </w:p>
-        </w:tc>
-        <w:tc>
-          <w:tcPr>
-            <w:tcW w:type="dxa" w:w="907"/>
-          </w:tcPr>
-          <w:p>
-            <w:pPr>
-              <w:spacing w:after="20" w:before="20" w:line="240" w:lineRule="auto"/>
-              <w:ind w:firstLine="0"/>
-              <w:jc w:val="left"/>
-            </w:pPr>
-            <w:r/>
-            <w:r>
-              <w:rPr>
-                <w:b w:val="0"/>
-                <w:sz w:val="17"/>
-              </w:rPr>
-              <w:t>20%</w:t>
-            </w:r>
-          </w:p>
-        </w:tc>
-        <w:tc>
-          <w:tcPr>
-            <w:tcW w:type="dxa" w:w="850"/>
-          </w:tcPr>
-          <w:p>
-            <w:pPr>
-              <w:spacing w:after="20" w:before="20" w:line="240" w:lineRule="auto"/>
-              <w:ind w:firstLine="0"/>
-              <w:jc w:val="left"/>
-            </w:pPr>
-            <w:r/>
-            <w:r>
-              <w:rPr>
-                <w:b w:val="0"/>
-                <w:sz w:val="17"/>
-              </w:rPr>
-              <w:t>92%</w:t>
-            </w:r>
-          </w:p>
-        </w:tc>
-        <w:tc>
-          <w:tcPr>
-            <w:tcW w:type="dxa" w:w="794"/>
-          </w:tcPr>
-          <w:p>
-            <w:pPr>
-              <w:spacing w:after="20" w:before="20" w:line="240" w:lineRule="auto"/>
-              <w:ind w:firstLine="0"/>
-              <w:jc w:val="left"/>
-            </w:pPr>
-            <w:r/>
-            <w:r>
-              <w:rPr>
-                <w:b w:val="0"/>
-                <w:sz w:val="17"/>
-              </w:rPr>
-              <w:t>44%</w:t>
+            <w:tcW w:type="dxa" w:w="1474"/>
+          </w:tcPr>
+          <w:p>
+            <w:pPr>
+              <w:spacing w:after="20" w:before="20" w:line="240" w:lineRule="auto"/>
+              <w:ind w:firstLine="0"/>
+              <w:jc w:val="left"/>
+            </w:pPr>
+            <w:r/>
+            <w:r>
+              <w:rPr>
+                <w:b w:val="0"/>
+                <w:sz w:val="16"/>
+              </w:rPr>
+              <w:t>67,3</w:t>
+            </w:r>
+          </w:p>
+        </w:tc>
+        <w:tc>
+          <w:tcPr>
+            <w:tcW w:type="dxa" w:w="1247"/>
+          </w:tcPr>
+          <w:p>
+            <w:pPr>
+              <w:spacing w:after="20" w:before="20" w:line="240" w:lineRule="auto"/>
+              <w:ind w:firstLine="0"/>
+              <w:jc w:val="left"/>
+            </w:pPr>
+            <w:r/>
+            <w:r>
+              <w:rPr>
+                <w:b w:val="0"/>
+                <w:sz w:val="16"/>
+              </w:rPr>
+              <w:t>1.641,6 (total)</w:t>
             </w:r>
           </w:p>
         </w:tc>
@@ -7771,6 +7835,26 @@
       <w:tr>
         <w:tc>
           <w:tcPr>
+            <w:tcW w:type="dxa" w:w="2494"/>
+          </w:tcPr>
+          <w:p>
+            <w:pPr>
+              <w:spacing w:after="20" w:before="20" w:line="240" w:lineRule="auto"/>
+              <w:ind w:firstLine="0"/>
+              <w:jc w:val="left"/>
+            </w:pPr>
+            <w:r/>
+            <w:r>
+              <w:rPr>
+                <w:b/>
+                <w:sz w:val="16"/>
+              </w:rPr>
+              <w:t>Concentração de destinos (HHI, 0 a 1)*</w:t>
+            </w:r>
+          </w:p>
+        </w:tc>
+        <w:tc>
+          <w:tcPr>
             <w:tcW w:type="dxa" w:w="2041"/>
           </w:tcPr>
           <w:p>
@@ -7783,12 +7867,74 @@
             <w:r>
               <w:rPr>
                 <w:b w:val="0"/>
-                <w:sz w:val="17"/>
-              </w:rPr>
-              <w:t>G3 – Orientados a EUA e União Europeia</w:t>
-            </w:r>
-          </w:p>
-        </w:tc>
+                <w:sz w:val="16"/>
+              </w:rPr>
+              <w:t>0,12</w:t>
+            </w:r>
+          </w:p>
+        </w:tc>
+        <w:tc>
+          <w:tcPr>
+            <w:tcW w:type="dxa" w:w="1814"/>
+          </w:tcPr>
+          <w:p>
+            <w:pPr>
+              <w:spacing w:after="20" w:before="20" w:line="240" w:lineRule="auto"/>
+              <w:ind w:firstLine="0"/>
+              <w:jc w:val="left"/>
+            </w:pPr>
+            <w:r/>
+            <w:r>
+              <w:rPr>
+                <w:b/>
+                <w:sz w:val="16"/>
+              </w:rPr>
+              <w:t>0,24</w:t>
+            </w:r>
+          </w:p>
+        </w:tc>
+        <w:tc>
+          <w:tcPr>
+            <w:tcW w:type="dxa" w:w="1474"/>
+          </w:tcPr>
+          <w:p>
+            <w:pPr>
+              <w:spacing w:after="20" w:before="20" w:line="240" w:lineRule="auto"/>
+              <w:ind w:firstLine="0"/>
+              <w:jc w:val="left"/>
+            </w:pPr>
+            <w:r/>
+            <w:r>
+              <w:rPr>
+                <w:b w:val="0"/>
+                <w:sz w:val="16"/>
+              </w:rPr>
+              <w:t>0,13</w:t>
+            </w:r>
+          </w:p>
+        </w:tc>
+        <w:tc>
+          <w:tcPr>
+            <w:tcW w:type="dxa" w:w="1247"/>
+          </w:tcPr>
+          <w:p>
+            <w:pPr>
+              <w:spacing w:after="20" w:before="20" w:line="240" w:lineRule="auto"/>
+              <w:ind w:firstLine="0"/>
+              <w:jc w:val="left"/>
+            </w:pPr>
+            <w:r/>
+            <w:r>
+              <w:rPr>
+                <w:b w:val="0"/>
+                <w:sz w:val="16"/>
+              </w:rPr>
+              <w:t>0,16</w:t>
+            </w:r>
+          </w:p>
+        </w:tc>
+      </w:tr>
+      <w:tr>
         <w:tc>
           <w:tcPr>
             <w:tcW w:type="dxa" w:w="2494"/>
@@ -7802,48 +7948,68 @@
             <w:r/>
             <w:r>
               <w:rPr>
-                <w:b w:val="0"/>
-                <w:sz w:val="17"/>
-              </w:rPr>
-              <w:t>AP, CE, ES, PB, RN, SE</w:t>
-            </w:r>
-          </w:p>
-        </w:tc>
-        <w:tc>
-          <w:tcPr>
-            <w:tcW w:type="dxa" w:w="1191"/>
-          </w:tcPr>
-          <w:p>
-            <w:pPr>
-              <w:spacing w:after="20" w:before="20" w:line="240" w:lineRule="auto"/>
-              <w:ind w:firstLine="0"/>
-              <w:jc w:val="left"/>
-            </w:pPr>
-            <w:r/>
-            <w:r>
-              <w:rPr>
-                <w:b w:val="0"/>
-                <w:sz w:val="17"/>
-              </w:rPr>
-              <w:t>67,3</w:t>
-            </w:r>
-          </w:p>
-        </w:tc>
-        <w:tc>
-          <w:tcPr>
-            <w:tcW w:type="dxa" w:w="794"/>
-          </w:tcPr>
-          <w:p>
-            <w:pPr>
-              <w:spacing w:after="20" w:before="20" w:line="240" w:lineRule="auto"/>
-              <w:ind w:firstLine="0"/>
-              <w:jc w:val="left"/>
-            </w:pPr>
-            <w:r/>
-            <w:r>
-              <w:rPr>
-                <w:b w:val="0"/>
-                <w:sz w:val="17"/>
+                <w:b/>
+                <w:sz w:val="16"/>
+              </w:rPr>
+              <w:t>% China*</w:t>
+            </w:r>
+          </w:p>
+        </w:tc>
+        <w:tc>
+          <w:tcPr>
+            <w:tcW w:type="dxa" w:w="2041"/>
+          </w:tcPr>
+          <w:p>
+            <w:pPr>
+              <w:spacing w:after="20" w:before="20" w:line="240" w:lineRule="auto"/>
+              <w:ind w:firstLine="0"/>
+              <w:jc w:val="left"/>
+            </w:pPr>
+            <w:r/>
+            <w:r>
+              <w:rPr>
+                <w:b w:val="0"/>
+                <w:sz w:val="16"/>
+              </w:rPr>
+              <w:t>20%</w:t>
+            </w:r>
+          </w:p>
+        </w:tc>
+        <w:tc>
+          <w:tcPr>
+            <w:tcW w:type="dxa" w:w="1814"/>
+          </w:tcPr>
+          <w:p>
+            <w:pPr>
+              <w:spacing w:after="20" w:before="20" w:line="240" w:lineRule="auto"/>
+              <w:ind w:firstLine="0"/>
+              <w:jc w:val="left"/>
+            </w:pPr>
+            <w:r/>
+            <w:r>
+              <w:rPr>
+                <w:b/>
+                <w:sz w:val="16"/>
+              </w:rPr>
+              <w:t>38%</w:t>
+            </w:r>
+          </w:p>
+        </w:tc>
+        <w:tc>
+          <w:tcPr>
+            <w:tcW w:type="dxa" w:w="1474"/>
+          </w:tcPr>
+          <w:p>
+            <w:pPr>
+              <w:spacing w:after="20" w:before="20" w:line="240" w:lineRule="auto"/>
+              <w:ind w:firstLine="0"/>
+              <w:jc w:val="left"/>
+            </w:pPr>
+            <w:r/>
+            <w:r>
+              <w:rPr>
+                <w:b w:val="0"/>
+                <w:sz w:val="16"/>
               </w:rPr>
               <w:t>5%</w:t>
             </w:r>
@@ -7851,39 +8017,509 @@
         </w:tc>
         <w:tc>
           <w:tcPr>
-            <w:tcW w:type="dxa" w:w="907"/>
-          </w:tcPr>
-          <w:p>
-            <w:pPr>
-              <w:spacing w:after="20" w:before="20" w:line="240" w:lineRule="auto"/>
-              <w:ind w:firstLine="0"/>
-              <w:jc w:val="left"/>
-            </w:pPr>
-            <w:r/>
-            <w:r>
-              <w:rPr>
-                <w:b w:val="0"/>
-                <w:sz w:val="17"/>
-              </w:rPr>
-              <w:t>53%</w:t>
-            </w:r>
-          </w:p>
-        </w:tc>
-        <w:tc>
-          <w:tcPr>
-            <w:tcW w:type="dxa" w:w="850"/>
-          </w:tcPr>
-          <w:p>
-            <w:pPr>
-              <w:spacing w:after="20" w:before="20" w:line="240" w:lineRule="auto"/>
-              <w:ind w:firstLine="0"/>
-              <w:jc w:val="left"/>
-            </w:pPr>
-            <w:r/>
-            <w:r>
-              <w:rPr>
-                <w:b w:val="0"/>
-                <w:sz w:val="17"/>
+            <w:tcW w:type="dxa" w:w="1247"/>
+          </w:tcPr>
+          <w:p>
+            <w:pPr>
+              <w:spacing w:after="20" w:before="20" w:line="240" w:lineRule="auto"/>
+              <w:ind w:firstLine="0"/>
+              <w:jc w:val="left"/>
+            </w:pPr>
+            <w:r/>
+            <w:r>
+              <w:rPr>
+                <w:b w:val="0"/>
+                <w:sz w:val="16"/>
+              </w:rPr>
+              <w:t>23%</w:t>
+            </w:r>
+          </w:p>
+        </w:tc>
+      </w:tr>
+      <w:tr>
+        <w:tc>
+          <w:tcPr>
+            <w:tcW w:type="dxa" w:w="2494"/>
+          </w:tcPr>
+          <w:p>
+            <w:pPr>
+              <w:spacing w:after="20" w:before="20" w:line="240" w:lineRule="auto"/>
+              <w:ind w:firstLine="0"/>
+              <w:jc w:val="left"/>
+            </w:pPr>
+            <w:r/>
+            <w:r>
+              <w:rPr>
+                <w:b/>
+                <w:sz w:val="16"/>
+              </w:rPr>
+              <w:t>% EUA*</w:t>
+            </w:r>
+          </w:p>
+        </w:tc>
+        <w:tc>
+          <w:tcPr>
+            <w:tcW w:type="dxa" w:w="2041"/>
+          </w:tcPr>
+          <w:p>
+            <w:pPr>
+              <w:spacing w:after="20" w:before="20" w:line="240" w:lineRule="auto"/>
+              <w:ind w:firstLine="0"/>
+              <w:jc w:val="left"/>
+            </w:pPr>
+            <w:r/>
+            <w:r>
+              <w:rPr>
+                <w:b w:val="0"/>
+                <w:sz w:val="16"/>
+              </w:rPr>
+              <w:t>9%</w:t>
+            </w:r>
+          </w:p>
+        </w:tc>
+        <w:tc>
+          <w:tcPr>
+            <w:tcW w:type="dxa" w:w="1814"/>
+          </w:tcPr>
+          <w:p>
+            <w:pPr>
+              <w:spacing w:after="20" w:before="20" w:line="240" w:lineRule="auto"/>
+              <w:ind w:firstLine="0"/>
+              <w:jc w:val="left"/>
+            </w:pPr>
+            <w:r/>
+            <w:r>
+              <w:rPr>
+                <w:b w:val="0"/>
+                <w:sz w:val="16"/>
+              </w:rPr>
+              <w:t>5%</w:t>
+            </w:r>
+          </w:p>
+        </w:tc>
+        <w:tc>
+          <w:tcPr>
+            <w:tcW w:type="dxa" w:w="1474"/>
+          </w:tcPr>
+          <w:p>
+            <w:pPr>
+              <w:spacing w:after="20" w:before="20" w:line="240" w:lineRule="auto"/>
+              <w:ind w:firstLine="0"/>
+              <w:jc w:val="left"/>
+            </w:pPr>
+            <w:r/>
+            <w:r>
+              <w:rPr>
+                <w:b/>
+                <w:sz w:val="16"/>
+              </w:rPr>
+              <w:t>24%</w:t>
+            </w:r>
+          </w:p>
+        </w:tc>
+        <w:tc>
+          <w:tcPr>
+            <w:tcW w:type="dxa" w:w="1247"/>
+          </w:tcPr>
+          <w:p>
+            <w:pPr>
+              <w:spacing w:after="20" w:before="20" w:line="240" w:lineRule="auto"/>
+              <w:ind w:firstLine="0"/>
+              <w:jc w:val="left"/>
+            </w:pPr>
+            <w:r/>
+            <w:r>
+              <w:rPr>
+                <w:b w:val="0"/>
+                <w:sz w:val="16"/>
+              </w:rPr>
+              <w:t>11%</w:t>
+            </w:r>
+          </w:p>
+        </w:tc>
+      </w:tr>
+      <w:tr>
+        <w:tc>
+          <w:tcPr>
+            <w:tcW w:type="dxa" w:w="2494"/>
+          </w:tcPr>
+          <w:p>
+            <w:pPr>
+              <w:spacing w:after="20" w:before="20" w:line="240" w:lineRule="auto"/>
+              <w:ind w:firstLine="0"/>
+              <w:jc w:val="left"/>
+            </w:pPr>
+            <w:r/>
+            <w:r>
+              <w:rPr>
+                <w:b/>
+                <w:sz w:val="16"/>
+              </w:rPr>
+              <w:t>% União Europeia*</w:t>
+            </w:r>
+          </w:p>
+        </w:tc>
+        <w:tc>
+          <w:tcPr>
+            <w:tcW w:type="dxa" w:w="2041"/>
+          </w:tcPr>
+          <w:p>
+            <w:pPr>
+              <w:spacing w:after="20" w:before="20" w:line="240" w:lineRule="auto"/>
+              <w:ind w:firstLine="0"/>
+              <w:jc w:val="left"/>
+            </w:pPr>
+            <w:r/>
+            <w:r>
+              <w:rPr>
+                <w:b w:val="0"/>
+                <w:sz w:val="16"/>
+              </w:rPr>
+              <w:t>14%</w:t>
+            </w:r>
+          </w:p>
+        </w:tc>
+        <w:tc>
+          <w:tcPr>
+            <w:tcW w:type="dxa" w:w="1814"/>
+          </w:tcPr>
+          <w:p>
+            <w:pPr>
+              <w:spacing w:after="20" w:before="20" w:line="240" w:lineRule="auto"/>
+              <w:ind w:firstLine="0"/>
+              <w:jc w:val="left"/>
+            </w:pPr>
+            <w:r/>
+            <w:r>
+              <w:rPr>
+                <w:b w:val="0"/>
+                <w:sz w:val="16"/>
+              </w:rPr>
+              <w:t>15%</w:t>
+            </w:r>
+          </w:p>
+        </w:tc>
+        <w:tc>
+          <w:tcPr>
+            <w:tcW w:type="dxa" w:w="1474"/>
+          </w:tcPr>
+          <w:p>
+            <w:pPr>
+              <w:spacing w:after="20" w:before="20" w:line="240" w:lineRule="auto"/>
+              <w:ind w:firstLine="0"/>
+              <w:jc w:val="left"/>
+            </w:pPr>
+            <w:r/>
+            <w:r>
+              <w:rPr>
+                <w:b/>
+                <w:sz w:val="16"/>
+              </w:rPr>
+              <w:t>29%</w:t>
+            </w:r>
+          </w:p>
+        </w:tc>
+        <w:tc>
+          <w:tcPr>
+            <w:tcW w:type="dxa" w:w="1247"/>
+          </w:tcPr>
+          <w:p>
+            <w:pPr>
+              <w:spacing w:after="20" w:before="20" w:line="240" w:lineRule="auto"/>
+              <w:ind w:firstLine="0"/>
+              <w:jc w:val="left"/>
+            </w:pPr>
+            <w:r/>
+            <w:r>
+              <w:rPr>
+                <w:b w:val="0"/>
+                <w:sz w:val="16"/>
+              </w:rPr>
+              <w:t>18%</w:t>
+            </w:r>
+          </w:p>
+        </w:tc>
+      </w:tr>
+      <w:tr>
+        <w:tc>
+          <w:tcPr>
+            <w:tcW w:type="dxa" w:w="2494"/>
+          </w:tcPr>
+          <w:p>
+            <w:pPr>
+              <w:spacing w:after="20" w:before="20" w:line="240" w:lineRule="auto"/>
+              <w:ind w:firstLine="0"/>
+              <w:jc w:val="left"/>
+            </w:pPr>
+            <w:r/>
+            <w:r>
+              <w:rPr>
+                <w:b/>
+                <w:sz w:val="16"/>
+              </w:rPr>
+              <w:t>% Mercosul*</w:t>
+            </w:r>
+          </w:p>
+        </w:tc>
+        <w:tc>
+          <w:tcPr>
+            <w:tcW w:type="dxa" w:w="2041"/>
+          </w:tcPr>
+          <w:p>
+            <w:pPr>
+              <w:spacing w:after="20" w:before="20" w:line="240" w:lineRule="auto"/>
+              <w:ind w:firstLine="0"/>
+              <w:jc w:val="left"/>
+            </w:pPr>
+            <w:r/>
+            <w:r>
+              <w:rPr>
+                <w:b/>
+                <w:sz w:val="16"/>
+              </w:rPr>
+              <w:t>9%</w:t>
+            </w:r>
+          </w:p>
+        </w:tc>
+        <w:tc>
+          <w:tcPr>
+            <w:tcW w:type="dxa" w:w="1814"/>
+          </w:tcPr>
+          <w:p>
+            <w:pPr>
+              <w:spacing w:after="20" w:before="20" w:line="240" w:lineRule="auto"/>
+              <w:ind w:firstLine="0"/>
+              <w:jc w:val="left"/>
+            </w:pPr>
+            <w:r/>
+            <w:r>
+              <w:rPr>
+                <w:b w:val="0"/>
+                <w:sz w:val="16"/>
+              </w:rPr>
+              <w:t>1%</w:t>
+            </w:r>
+          </w:p>
+        </w:tc>
+        <w:tc>
+          <w:tcPr>
+            <w:tcW w:type="dxa" w:w="1474"/>
+          </w:tcPr>
+          <w:p>
+            <w:pPr>
+              <w:spacing w:after="20" w:before="20" w:line="240" w:lineRule="auto"/>
+              <w:ind w:firstLine="0"/>
+              <w:jc w:val="left"/>
+            </w:pPr>
+            <w:r/>
+            <w:r>
+              <w:rPr>
+                <w:b w:val="0"/>
+                <w:sz w:val="16"/>
+              </w:rPr>
+              <w:t>3%</w:t>
+            </w:r>
+          </w:p>
+        </w:tc>
+        <w:tc>
+          <w:tcPr>
+            <w:tcW w:type="dxa" w:w="1247"/>
+          </w:tcPr>
+          <w:p>
+            <w:pPr>
+              <w:spacing w:after="20" w:before="20" w:line="240" w:lineRule="auto"/>
+              <w:ind w:firstLine="0"/>
+              <w:jc w:val="left"/>
+            </w:pPr>
+            <w:r/>
+            <w:r>
+              <w:rPr>
+                <w:b w:val="0"/>
+                <w:sz w:val="16"/>
+              </w:rPr>
+              <w:t>5%</w:t>
+            </w:r>
+          </w:p>
+        </w:tc>
+      </w:tr>
+      <w:tr>
+        <w:tc>
+          <w:tcPr>
+            <w:tcW w:type="dxa" w:w="2494"/>
+          </w:tcPr>
+          <w:p>
+            <w:pPr>
+              <w:spacing w:after="20" w:before="20" w:line="240" w:lineRule="auto"/>
+              <w:ind w:firstLine="0"/>
+              <w:jc w:val="left"/>
+            </w:pPr>
+            <w:r/>
+            <w:r>
+              <w:rPr>
+                <w:b/>
+                <w:sz w:val="16"/>
+              </w:rPr>
+              <w:t>Concentração de produtos (HHI SH4, 0 a 1)*</w:t>
+            </w:r>
+          </w:p>
+        </w:tc>
+        <w:tc>
+          <w:tcPr>
+            <w:tcW w:type="dxa" w:w="2041"/>
+          </w:tcPr>
+          <w:p>
+            <w:pPr>
+              <w:spacing w:after="20" w:before="20" w:line="240" w:lineRule="auto"/>
+              <w:ind w:firstLine="0"/>
+              <w:jc w:val="left"/>
+            </w:pPr>
+            <w:r/>
+            <w:r>
+              <w:rPr>
+                <w:b w:val="0"/>
+                <w:sz w:val="16"/>
+              </w:rPr>
+              <w:t>0,12</w:t>
+            </w:r>
+          </w:p>
+        </w:tc>
+        <w:tc>
+          <w:tcPr>
+            <w:tcW w:type="dxa" w:w="1814"/>
+          </w:tcPr>
+          <w:p>
+            <w:pPr>
+              <w:spacing w:after="20" w:before="20" w:line="240" w:lineRule="auto"/>
+              <w:ind w:firstLine="0"/>
+              <w:jc w:val="left"/>
+            </w:pPr>
+            <w:r/>
+            <w:r>
+              <w:rPr>
+                <w:b/>
+                <w:sz w:val="16"/>
+              </w:rPr>
+              <w:t>0,37</w:t>
+            </w:r>
+          </w:p>
+        </w:tc>
+        <w:tc>
+          <w:tcPr>
+            <w:tcW w:type="dxa" w:w="1474"/>
+          </w:tcPr>
+          <w:p>
+            <w:pPr>
+              <w:spacing w:after="20" w:before="20" w:line="240" w:lineRule="auto"/>
+              <w:ind w:firstLine="0"/>
+              <w:jc w:val="left"/>
+            </w:pPr>
+            <w:r/>
+            <w:r>
+              <w:rPr>
+                <w:b w:val="0"/>
+                <w:sz w:val="16"/>
+              </w:rPr>
+              <w:t>0,24</w:t>
+            </w:r>
+          </w:p>
+        </w:tc>
+        <w:tc>
+          <w:tcPr>
+            <w:tcW w:type="dxa" w:w="1247"/>
+          </w:tcPr>
+          <w:p>
+            <w:pPr>
+              <w:spacing w:after="20" w:before="20" w:line="240" w:lineRule="auto"/>
+              <w:ind w:firstLine="0"/>
+              <w:jc w:val="left"/>
+            </w:pPr>
+            <w:r/>
+            <w:r>
+              <w:rPr>
+                <w:b w:val="0"/>
+                <w:sz w:val="16"/>
+              </w:rPr>
+              <w:t>0,23</w:t>
+            </w:r>
+          </w:p>
+        </w:tc>
+      </w:tr>
+      <w:tr>
+        <w:tc>
+          <w:tcPr>
+            <w:tcW w:type="dxa" w:w="2494"/>
+          </w:tcPr>
+          <w:p>
+            <w:pPr>
+              <w:spacing w:after="20" w:before="20" w:line="240" w:lineRule="auto"/>
+              <w:ind w:firstLine="0"/>
+              <w:jc w:val="left"/>
+            </w:pPr>
+            <w:r/>
+            <w:r>
+              <w:rPr>
+                <w:b/>
+                <w:sz w:val="16"/>
+              </w:rPr>
+              <w:t>% produtos básicos (SH 01–27)*</w:t>
+            </w:r>
+          </w:p>
+        </w:tc>
+        <w:tc>
+          <w:tcPr>
+            <w:tcW w:type="dxa" w:w="2041"/>
+          </w:tcPr>
+          <w:p>
+            <w:pPr>
+              <w:spacing w:after="20" w:before="20" w:line="240" w:lineRule="auto"/>
+              <w:ind w:firstLine="0"/>
+              <w:jc w:val="left"/>
+            </w:pPr>
+            <w:r/>
+            <w:r>
+              <w:rPr>
+                <w:b w:val="0"/>
+                <w:sz w:val="16"/>
+              </w:rPr>
+              <w:t>60%</w:t>
+            </w:r>
+          </w:p>
+        </w:tc>
+        <w:tc>
+          <w:tcPr>
+            <w:tcW w:type="dxa" w:w="1814"/>
+          </w:tcPr>
+          <w:p>
+            <w:pPr>
+              <w:spacing w:after="20" w:before="20" w:line="240" w:lineRule="auto"/>
+              <w:ind w:firstLine="0"/>
+              <w:jc w:val="left"/>
+            </w:pPr>
+            <w:r/>
+            <w:r>
+              <w:rPr>
+                <w:b/>
+                <w:sz w:val="16"/>
+              </w:rPr>
+              <w:t>92%</w:t>
+            </w:r>
+          </w:p>
+        </w:tc>
+        <w:tc>
+          <w:tcPr>
+            <w:tcW w:type="dxa" w:w="1474"/>
+          </w:tcPr>
+          <w:p>
+            <w:pPr>
+              <w:spacing w:after="20" w:before="20" w:line="240" w:lineRule="auto"/>
+              <w:ind w:firstLine="0"/>
+              <w:jc w:val="left"/>
+            </w:pPr>
+            <w:r/>
+            <w:r>
+              <w:rPr>
+                <w:b w:val="0"/>
+                <w:sz w:val="16"/>
               </w:rPr>
               <w:t>61%</w:t>
             </w:r>
@@ -7891,21 +8527,225 @@
         </w:tc>
         <w:tc>
           <w:tcPr>
-            <w:tcW w:type="dxa" w:w="794"/>
-          </w:tcPr>
-          <w:p>
-            <w:pPr>
-              <w:spacing w:after="20" w:before="20" w:line="240" w:lineRule="auto"/>
-              <w:ind w:firstLine="0"/>
-              <w:jc w:val="left"/>
-            </w:pPr>
-            <w:r/>
-            <w:r>
-              <w:rPr>
-                <w:b w:val="0"/>
-                <w:sz w:val="17"/>
+            <w:tcW w:type="dxa" w:w="1247"/>
+          </w:tcPr>
+          <w:p>
+            <w:pPr>
+              <w:spacing w:after="20" w:before="20" w:line="240" w:lineRule="auto"/>
+              <w:ind w:firstLine="0"/>
+              <w:jc w:val="left"/>
+            </w:pPr>
+            <w:r/>
+            <w:r>
+              <w:rPr>
+                <w:b w:val="0"/>
+                <w:sz w:val="16"/>
+              </w:rPr>
+              <w:t>71%</w:t>
+            </w:r>
+          </w:p>
+        </w:tc>
+      </w:tr>
+      <w:tr>
+        <w:tc>
+          <w:tcPr>
+            <w:tcW w:type="dxa" w:w="2494"/>
+          </w:tcPr>
+          <w:p>
+            <w:pPr>
+              <w:spacing w:after="20" w:before="20" w:line="240" w:lineRule="auto"/>
+              <w:ind w:firstLine="0"/>
+              <w:jc w:val="left"/>
+            </w:pPr>
+            <w:r/>
+            <w:r>
+              <w:rPr>
+                <w:b/>
+                <w:sz w:val="16"/>
+              </w:rPr>
+              <w:t>Preço médio (US$/kg)*</w:t>
+            </w:r>
+          </w:p>
+        </w:tc>
+        <w:tc>
+          <w:tcPr>
+            <w:tcW w:type="dxa" w:w="2041"/>
+          </w:tcPr>
+          <w:p>
+            <w:pPr>
+              <w:spacing w:after="20" w:before="20" w:line="240" w:lineRule="auto"/>
+              <w:ind w:firstLine="0"/>
+              <w:jc w:val="left"/>
+            </w:pPr>
+            <w:r/>
+            <w:r>
+              <w:rPr>
+                <w:b/>
+                <w:sz w:val="16"/>
+              </w:rPr>
+              <w:t>1,04</w:t>
+            </w:r>
+          </w:p>
+        </w:tc>
+        <w:tc>
+          <w:tcPr>
+            <w:tcW w:type="dxa" w:w="1814"/>
+          </w:tcPr>
+          <w:p>
+            <w:pPr>
+              <w:spacing w:after="20" w:before="20" w:line="240" w:lineRule="auto"/>
+              <w:ind w:firstLine="0"/>
+              <w:jc w:val="left"/>
+            </w:pPr>
+            <w:r/>
+            <w:r>
+              <w:rPr>
+                <w:b w:val="0"/>
+                <w:sz w:val="16"/>
+              </w:rPr>
+              <w:t>0,54</w:t>
+            </w:r>
+          </w:p>
+        </w:tc>
+        <w:tc>
+          <w:tcPr>
+            <w:tcW w:type="dxa" w:w="1474"/>
+          </w:tcPr>
+          <w:p>
+            <w:pPr>
+              <w:spacing w:after="20" w:before="20" w:line="240" w:lineRule="auto"/>
+              <w:ind w:firstLine="0"/>
+              <w:jc w:val="left"/>
+            </w:pPr>
+            <w:r/>
+            <w:r>
+              <w:rPr>
+                <w:b w:val="0"/>
+                <w:sz w:val="16"/>
+              </w:rPr>
+              <w:t>0,51</w:t>
+            </w:r>
+          </w:p>
+        </w:tc>
+        <w:tc>
+          <w:tcPr>
+            <w:tcW w:type="dxa" w:w="1247"/>
+          </w:tcPr>
+          <w:p>
+            <w:pPr>
+              <w:spacing w:after="20" w:before="20" w:line="240" w:lineRule="auto"/>
+              <w:ind w:firstLine="0"/>
+              <w:jc w:val="left"/>
+            </w:pPr>
+            <w:r/>
+            <w:r>
+              <w:rPr>
+                <w:b w:val="0"/>
+                <w:sz w:val="16"/>
+              </w:rPr>
+              <w:t>0,76</w:t>
+            </w:r>
+          </w:p>
+        </w:tc>
+      </w:tr>
+      <w:tr>
+        <w:tc>
+          <w:tcPr>
+            <w:tcW w:type="dxa" w:w="2494"/>
+          </w:tcPr>
+          <w:p>
+            <w:pPr>
+              <w:spacing w:after="20" w:before="20" w:line="240" w:lineRule="auto"/>
+              <w:ind w:firstLine="0"/>
+              <w:jc w:val="left"/>
+            </w:pPr>
+            <w:r/>
+            <w:r>
+              <w:rPr>
+                <w:b/>
+                <w:sz w:val="16"/>
+              </w:rPr>
+              <w:t>% do 1º destino (descritivo)</w:t>
+            </w:r>
+          </w:p>
+        </w:tc>
+        <w:tc>
+          <w:tcPr>
+            <w:tcW w:type="dxa" w:w="2041"/>
+          </w:tcPr>
+          <w:p>
+            <w:pPr>
+              <w:spacing w:after="20" w:before="20" w:line="240" w:lineRule="auto"/>
+              <w:ind w:firstLine="0"/>
+              <w:jc w:val="left"/>
+            </w:pPr>
+            <w:r/>
+            <w:r>
+              <w:rPr>
+                <w:b w:val="0"/>
+                <w:sz w:val="16"/>
+              </w:rPr>
+              <w:t>26%</w:t>
+            </w:r>
+          </w:p>
+        </w:tc>
+        <w:tc>
+          <w:tcPr>
+            <w:tcW w:type="dxa" w:w="1814"/>
+          </w:tcPr>
+          <w:p>
+            <w:pPr>
+              <w:spacing w:after="20" w:before="20" w:line="240" w:lineRule="auto"/>
+              <w:ind w:firstLine="0"/>
+              <w:jc w:val="left"/>
+            </w:pPr>
+            <w:r/>
+            <w:r>
+              <w:rPr>
+                <w:b w:val="0"/>
+                <w:sz w:val="16"/>
+              </w:rPr>
+              <w:t>44%</w:t>
+            </w:r>
+          </w:p>
+        </w:tc>
+        <w:tc>
+          <w:tcPr>
+            <w:tcW w:type="dxa" w:w="1474"/>
+          </w:tcPr>
+          <w:p>
+            <w:pPr>
+              <w:spacing w:after="20" w:before="20" w:line="240" w:lineRule="auto"/>
+              <w:ind w:firstLine="0"/>
+              <w:jc w:val="left"/>
+            </w:pPr>
+            <w:r/>
+            <w:r>
+              <w:rPr>
+                <w:b w:val="0"/>
+                <w:sz w:val="16"/>
               </w:rPr>
               <w:t>28%</w:t>
+            </w:r>
+          </w:p>
+        </w:tc>
+        <w:tc>
+          <w:tcPr>
+            <w:tcW w:type="dxa" w:w="1247"/>
+          </w:tcPr>
+          <w:p>
+            <w:pPr>
+              <w:spacing w:after="20" w:before="20" w:line="240" w:lineRule="auto"/>
+              <w:ind w:firstLine="0"/>
+              <w:jc w:val="left"/>
+            </w:pPr>
+            <w:r/>
+            <w:r>
+              <w:rPr>
+                <w:b w:val="0"/>
+                <w:sz w:val="16"/>
+              </w:rPr>
+              <w:t>33%</w:t>
             </w:r>
           </w:p>
         </w:tc>
@@ -7922,7 +8762,19 @@
           <w:i w:val="0"/>
           <w:sz w:val="18"/>
         </w:rPr>
-        <w:t>Fonte: elaborado pelo autor. Percentuais = média simples das UFs de cada grupo.</w:t>
+        <w:t>Fonte: elaborado pelo autor. * = variável usada no agrupamento (o preço entrou em logaritmo). Médias simples das UFs de cada grupo; em negrito, o valor que mais distingue o grupo.</w:t>
+      </w:r>
+    </w:p>
+    <w:p>
+      <w:pPr>
+        <w:spacing w:after="120"/>
+        <w:jc w:val="both"/>
+      </w:pPr>
+      <w:r>
+        <w:rPr>
+          <w:i w:val="0"/>
+        </w:rPr>
+        <w:t>A interpretação de cada perfil se apoia nas variáveis que mais o diferenciam: o G2 combina a maior concentração de destinos e de produtos (HHI de 0,24 e 0,37), a maior participação da China (38%) e de produtos básicos (92%); o G3 tem a maior participação de EUA (24%) e União Europeia (29%) e quase nenhuma exposição à China (5%); o G1 tem as menores concentrações (HHI de 0,12 em destinos e produtos), o maior peso do Mercosul (9%) e o maior preço médio (US$ 1,04/kg).</w:t>
       </w:r>
     </w:p>
     <w:p>
@@ -9692,6 +10544,18 @@
     </w:p>
     <w:p>
       <w:pPr>
+        <w:spacing w:after="120"/>
+        <w:jc w:val="both"/>
+      </w:pPr>
+      <w:r>
+        <w:rPr>
+          <w:i w:val="0"/>
+        </w:rPr>
+        <w:t>Os totais do Quadro 9 são os dos arquivos brutos, com todos os códigos de UF e de país. Os valores do painel e dos Quadros 7 e 10 excluem as UFs EX/ND e os países 100 e 105 (seção 3.1) e, por isso, são ligeiramente menores: em 2025, a exportação é de US$ 347,90 bi no painel contra US$ 348,28 bi nos arquivos brutos (diferença de US$ 0,38 bi, 0,1%); em 2024, de US$ 336,47 bi contra US$ 337,05 bi (US$ 0,58 bi, 0,2%); e em janeiro a setembro de 2026, de US$ 283,97 bi contra US$ 284,65 bi (US$ 0,68 bi, 0,2%). Em todos os anos e fluxos a diferença fica abaixo de 0,3% e vem quase toda dos códigos de país 100 e 105. A conferência do Quadro 10 aplica exatamente os mesmos filtros do painel.</w:t>
+      </w:r>
+    </w:p>
+    <w:p>
+      <w:pPr>
         <w:keepNext/>
         <w:spacing w:after="80"/>
         <w:ind w:firstLine="0"/>
@@ -10718,7 +11582,20 @@
         <w:rPr>
           <w:i w:val="0"/>
         </w:rPr>
-        <w:t>O principal achado é que a inserção externa dos estados brasileiros é desigual e, em boa parte, concentrada: nove UFs dependem de commodities vendidas a poucos destinos, sobretudo à China.</w:t>
+        <w:t>A análise separa o que os dados mostram (resultados observados), o que esses resultados significam (interpretação) e o que se propõe a partir deles (recomendações). O principal resultado observado é que a inserção externa dos estados brasileiros é desigual e, em boa parte, concentrada: nove UFs exportam sobretudo commodities para poucos destinos, com destaque para a China.</w:t>
+      </w:r>
+    </w:p>
+    <w:p>
+      <w:pPr>
+        <w:spacing w:after="120"/>
+        <w:ind w:firstLine="0"/>
+        <w:jc w:val="both"/>
+      </w:pPr>
+      <w:r>
+        <w:rPr>
+          <w:i w:val="0"/>
+        </w:rPr>
+        <w:t>Resultados observados:</w:t>
       </w:r>
     </w:p>
     <w:p>
@@ -10756,7 +11633,7 @@
         <w:t xml:space="preserve">Pauta primária. </w:t>
       </w:r>
       <w:r>
-        <w:t>Produtos básicos representam de 60% a 92% das exportações, conforme o grupo, e o preço médio exportado fica abaixo de 1 US$/kg em todos eles, o que indica baixo valor agregado.</w:t>
+        <w:t>Produtos básicos representam de 60% a 92% das exportações, conforme o grupo, e o preço médio fica em torno de US$ 0,5/kg no G2 e no G3 e de US$ 1,0/kg no G1.</w:t>
       </w:r>
     </w:p>
     <w:p>
@@ -10814,6 +11691,18 @@
       </w:r>
       <w:r>
         <w:t>As exportações seguem o calendário da safra e cresceram 10,3% em jan–set/2026 sobre o mesmo período de 2025.</w:t>
+      </w:r>
+    </w:p>
+    <w:p>
+      <w:pPr>
+        <w:spacing w:after="120"/>
+        <w:jc w:val="both"/>
+      </w:pPr>
+      <w:r>
+        <w:rPr>
+          <w:i w:val="0"/>
+        </w:rPr>
+        <w:t>Interpretação: a concentração em poucos destinos expõe as economias estaduais a choques de demanda, de preço ou de política comercial de um único parceiro. O preço médio baixo, somado à alta participação de produtos básicos, sugere predominância de produtos de menor valor unitário; o preço por quilo, sozinho, não mede valor agregado, pois varia muito entre tipos de mercadoria. Já os perfis do K-Means são exploratórios e servem para orientar investigações e políticas, não para prescrever uma estratégia única a todas as UFs de um grupo.</w:t>
       </w:r>
     </w:p>
     <w:p>
@@ -10841,6 +11730,18 @@
           <w:sz w:val="24"/>
         </w:rPr>
         <w:t>Proposta de intervenção</w:t>
+      </w:r>
+    </w:p>
+    <w:p>
+      <w:pPr>
+        <w:spacing w:after="120"/>
+        <w:jc w:val="both"/>
+      </w:pPr>
+      <w:r>
+        <w:rPr>
+          <w:i w:val="0"/>
+        </w:rPr>
+        <w:t>As recomendações do Quadro 11 são propostas deste projeto, a discutir com os gestores, e não consequências comprovadas pelas análises.</w:t>
       </w:r>
     </w:p>
     <w:p>
@@ -10921,7 +11822,7 @@
                 <w:b/>
                 <w:sz w:val="17"/>
               </w:rPr>
-              <w:t>Problema</w:t>
+              <w:t>Problema observado</w:t>
             </w:r>
           </w:p>
         </w:tc>
@@ -10942,7 +11843,7 @@
                 <w:b/>
                 <w:sz w:val="17"/>
               </w:rPr>
-              <w:t>Ações propostas</w:t>
+              <w:t>Ações recomendadas</w:t>
             </w:r>
           </w:p>
         </w:tc>
@@ -10963,7 +11864,7 @@
                 <w:b/>
                 <w:sz w:val="17"/>
               </w:rPr>
-              <w:t>Indicador de acompanhamento</w:t>
+              <w:t>Meta proposta / indicador</w:t>
             </w:r>
           </w:p>
         </w:tc>
@@ -11045,7 +11946,7 @@
                 <w:b w:val="0"/>
                 <w:sz w:val="17"/>
               </w:rPr>
-              <w:t>% Principal destino ≤ 35% em 3 anos; aumento do preço médio (US$/kg)</w:t>
+              <w:t>Meta: % principal destino ≤ 35% em 3 anos; aumento do preço médio (US$/kg)</w:t>
             </w:r>
           </w:p>
         </w:tc>
@@ -11209,7 +12110,7 @@
                 <w:b w:val="0"/>
                 <w:sz w:val="17"/>
               </w:rPr>
-              <w:t>Participação EUA + UE abaixo de 50% em SE e CE</w:t>
+              <w:t>Meta: participação EUA + UE abaixo de 50% em SE e CE</w:t>
             </w:r>
           </w:p>
         </w:tc>
@@ -11271,7 +12172,7 @@
                 <w:b w:val="0"/>
                 <w:sz w:val="17"/>
               </w:rPr>
-              <w:t>Monitoramento mensal com o painel; desvio acima de 10% entre real e previsto dispara análise</w:t>
+              <w:t>Monitoramento mensal com o painel; desvio acima de 10% entre o realizado e o previsto dispara análise</w:t>
             </w:r>
           </w:p>
         </w:tc>
@@ -11309,6 +12210,18 @@
           <w:sz w:val="18"/>
         </w:rPr>
         <w:t>Fonte: elaborado pelo autor.</w:t>
+      </w:r>
+    </w:p>
+    <w:p>
+      <w:pPr>
+        <w:spacing w:after="120"/>
+        <w:jc w:val="both"/>
+      </w:pPr>
+      <w:r>
+        <w:rPr>
+          <w:i w:val="0"/>
+        </w:rPr>
+        <w:t>Os limites foram definidos como referências iniciais: 35% fica entre a média nacional do principal destino (33%) e a média do G2 (44%), o que equivale a reduzir cerca de 9 pontos em 3 anos; 50% para EUA + UE fica pouco abaixo da média atual do G3 (53%); e o alerta de 10% fica acima do erro médio do modelo de previsão (MAPE de 7,5%), para disparar apenas desvios maiores que o erro esperado. Como as ações são definidas por grupo, cada UF deve ter seu plano ajustado à própria pauta.</w:t>
       </w:r>
     </w:p>
     <w:p>
@@ -11476,7 +12389,7 @@
         <w:rPr>
           <w:i w:val="0"/>
         </w:rPr>
-        <w:t>A previsão usa apenas o histórico da própria série e não incorpora preços de commodities, câmbio ou demanda externa; deve ser lida como cenário-base. A silhueta de 0,24 indica grupos de fronteiras pouco nítidas, esperado com 27 observações. A UF da base é a do domicílio fiscal da empresa, e os valores estão em dólares correntes, sem deflacionamento.</w:t>
+        <w:t>A previsão usa apenas o histórico da própria série e não incorpora preços de commodities, câmbio ou demanda externa; deve ser lida como cenário-base. Ela foi avaliada em uma única janela de teste (jan–set/2026), não houve análise formal dos resíduos da regressão (autocorrelação e normalidade), e a faixa de 95% é aproximada, baseada em apenas 9 erros de teste; uma validação com várias origens (rolling origin) daria evidência mais robusta. No agrupamento, as 27 observações limitam a generalização, e a silhueta de 0,24 indica grupos de fronteiras pouco nítidas. A UF da base é a do domicílio fiscal da empresa, e os valores estão em dólares correntes, sem deflacionamento.</w:t>
       </w:r>
     </w:p>
     <w:p>

</xml_diff>